<commit_message>
Serve native Word PDF downloads and synchronise article source
Keep Singapore as a review draft while preserving its canonical document, chart and dataset. Validate PDF exports against source checksums.

Co-authored-by: Copilot <223556219+Copilot@users.noreply.github.com>
</commit_message>
<xml_diff>
--- a/docs/writing/singapore–exchange_rate_policy.docx
+++ b/docs/writing/singapore–exchange_rate_policy.docx
@@ -90,71 +90,145 @@
     </w:p>
     <w:p>
       <w:r>
-        <w:t>One of the main macroeconomic objectives is to keep inflation low</w:t>
-      </w:r>
-      <w:r>
-        <w:t>–</w:t>
-      </w:r>
-      <w:r>
-        <w:t xml:space="preserve">usually around 2%. Due to the war, oil prices have surged, resulting in cost-push inflation for Singaporean consumers. To combat this, Singapore increases </w:t>
-      </w:r>
-      <w:r>
-        <w:t>its</w:t>
-      </w:r>
-      <w:r>
-        <w:t xml:space="preserve"> dollar’s rate of appreciation, strengthening it against other currencies worldwide. This means that oil can now be bought at a lower price. Now that prices are cheaper, it decreases Singapore’s inflation. </w:t>
+        <w:t>One of Singapore's main macroeconomic objectives is to maintain price stability over the medium term, supporting sustainable economic growth. Due to the war, oil prices have surged, resulting in cost-push inflation for Singaporean consumers. In April and July 2026, Singapore's central bank increased the rate of appreciation of its exchange-rate policy band. A stronger Singapore dollar can reduce the local-currency cost of imported energy, helping to moderate inflationary pressures.</w:t>
       </w:r>
     </w:p>
     <w:p>
       <w:r>
-        <w:t xml:space="preserve">The effects of this monetary policy can be seen through an AD/AS diagram. Thanks to the lower oil prices, it increases the productive capacity which domestic firms can produce, meaning the aggregate supply of Singapore would increase, shown through a rightward shift of the </w:t>
-      </w:r>
-      <w:r>
-        <w:t>s</w:t>
-      </w:r>
-      <w:r>
-        <w:t>hort-</w:t>
-      </w:r>
-      <w:r>
-        <w:t>r</w:t>
-      </w:r>
-      <w:r>
-        <w:t xml:space="preserve">un </w:t>
-      </w:r>
-      <w:r>
-        <w:t>a</w:t>
-      </w:r>
-      <w:r>
-        <w:t xml:space="preserve">ggregate </w:t>
-      </w:r>
-      <w:r>
-        <w:t>s</w:t>
-      </w:r>
-      <w:r>
-        <w:t xml:space="preserve">upply </w:t>
-      </w:r>
-      <w:r>
-        <w:t>(</w:t>
-      </w:r>
-      <w:r>
-        <w:t>SRAS</w:t>
-      </w:r>
-      <w:r>
-        <w:t>)</w:t>
-      </w:r>
-      <w:r>
-        <w:t>. Since SRAS shifts rightward, there is a new equilibrium where the price level is now lower for Singaporean consumers, resulting in lower inflation.</w:t>
+        <w:t>This effect can be explained using the aggregate demand–aggregate supply (AD–AS) model. Lower imported energy costs can reduce production costs for domestic firms, shifting short-run aggregate supply (SRAS) to the right. Assuming aggregate demand remains unchanged, this results in a lower equilibrium price level and higher real output than would otherwise have occurred.</w:t>
       </w:r>
     </w:p>
     <w:p>
-      <w:r>
-        <w:t>Even though these measures were put into place to try and negate the effects of the war, Singapore’s monetary authority stated “There are considerable risks around the outlook for inflation and growth”, and that “A more persistent disruption to energy supplies will exacerbate inflationary pressures worldwide, as well as deepen the drag on growth.”, saying that these measures put in place can negate only so much of the pressures caused by the war, further emphasizing the risk it has to Singapore’s economy, especially since some sectors are already experiencing economic contractions.</w:t>
+      <w:pPr>
+        <w:keepNext/>
+      </w:pPr>
+      <w:r>
+        <w:t xml:space="preserve">Despite these measures, the Monetary Authority of Singapore (MAS) warned that “There are considerable risks around the outlook for inflation and growth” and that “A more persistent disruption to energy supplies will exacerbate inflationary pressures worldwide, as well as </w:t>
+      </w:r>
+      <w:r>
+        <w:lastRenderedPageBreak/>
+        <w:t>deepen the drag on growth.” These warnings highlight the limits of exchange-rate policy in protecting Singapore's economy from prolonged external supply shocks.</w:t>
       </w:r>
     </w:p>
-    <w:p/>
-    <w:p/>
+    <w:p>
+      <w:pPr>
+        <w:keepNext/>
+      </w:pPr>
+      <w:r>
+        <w:rPr>
+          <w:noProof/>
+        </w:rPr>
+        <w:drawing>
+          <wp:inline distT="0" distB="0" distL="0" distR="0" wp14:anchorId="054DAD6F" wp14:editId="10033D57">
+            <wp:extent cx="5731510" cy="3438906"/>
+            <wp:effectExtent l="0" t="0" r="0" b="0"/>
+            <wp:docPr id="100" name="Singapore inflation chart" descr="Monthly headline and MAS core inflation, September 2025 to September 2026. Headline inflation rises from 0.7% to 2.2%; core inflation rises from 0.4% to 2.0%."/>
+            <wp:cNvGraphicFramePr>
+              <a:graphicFrameLocks xmlns:a="http://schemas.openxmlformats.org/drawingml/2006/main" noChangeAspect="1"/>
+            </wp:cNvGraphicFramePr>
+            <a:graphic xmlns:a="http://schemas.openxmlformats.org/drawingml/2006/main">
+              <a:graphicData uri="http://schemas.openxmlformats.org/drawingml/2006/picture">
+                <pic:pic xmlns:pic="http://schemas.openxmlformats.org/drawingml/2006/picture">
+                  <pic:nvPicPr>
+                    <pic:cNvPr id="0" name="singapore-inflation.png"/>
+                    <pic:cNvPicPr/>
+                  </pic:nvPicPr>
+                  <pic:blipFill>
+                    <a:blip r:embed="rId7"/>
+                    <a:stretch>
+                      <a:fillRect/>
+                    </a:stretch>
+                  </pic:blipFill>
+                  <pic:spPr>
+                    <a:xfrm>
+                      <a:off x="0" y="0"/>
+                      <a:ext cx="5731510" cy="3438906"/>
+                    </a:xfrm>
+                    <a:prstGeom prst="rect">
+                      <a:avLst/>
+                    </a:prstGeom>
+                  </pic:spPr>
+                </pic:pic>
+              </a:graphicData>
+            </a:graphic>
+          </wp:inline>
+        </w:drawing>
+      </w:r>
+    </w:p>
+    <w:p>
+      <w:pPr>
+        <w:pStyle w:val="Caption"/>
+      </w:pPr>
+      <w:r>
+        <w:rPr>
+          <w:b/>
+        </w:rPr>
+        <w:t>Figure 1.</w:t>
+      </w:r>
+      <w:r>
+        <w:t xml:space="preserve"> Singapore headline and MAS core inflation, September 2025–September 2026. Monthly year-on-year percentage change.</w:t>
+      </w:r>
+    </w:p>
+    <w:p>
+      <w:pPr>
+        <w:pStyle w:val="ArticleNote"/>
+      </w:pPr>
+      <w:r>
+        <w:t xml:space="preserve">The chart illustrates inflation trends during a period of monetary policy adjustments and global energy-price pressures. Although Singapore's exchange-rate policy seeks to moderate imported inflation, these observations alone cannot establish what inflation would have been without those interventions. Visualisation by James Newman using </w:t>
+      </w:r>
+      <w:hyperlink r:id="rId8">
+        <w:r>
+          <w:t>RAWGraphs</w:t>
+        </w:r>
+      </w:hyperlink>
+      <w:r>
+        <w:t xml:space="preserve">. </w:t>
+      </w:r>
+      <w:hyperlink r:id="rId9">
+        <w:r>
+          <w:t>Download dataset (CSV)</w:t>
+        </w:r>
+      </w:hyperlink>
+      <w:r>
+        <w:t>.</w:t>
+      </w:r>
+    </w:p>
+    <w:p>
+      <w:pPr>
+        <w:pStyle w:val="Heading2"/>
+      </w:pPr>
+      <w:r>
+        <w:t>Sources</w:t>
+      </w:r>
+    </w:p>
+    <w:p>
+      <w:pPr>
+        <w:pStyle w:val="ArticleNote"/>
+      </w:pPr>
+      <w:hyperlink r:id="rId10">
+        <w:r>
+          <w:rPr>
+            <w:rStyle w:val="Hyperlink"/>
+          </w:rPr>
+          <w:t>Monetary Authority of Singapore and Ministry of Trade and Industry. Consumer Price Developments in September 2026.</w:t>
+        </w:r>
+      </w:hyperlink>
+    </w:p>
+    <w:p>
+      <w:pPr>
+        <w:pStyle w:val="ArticleNote"/>
+      </w:pPr>
+      <w:hyperlink r:id="rId11">
+        <w:r>
+          <w:rPr>
+            <w:rStyle w:val="Hyperlink"/>
+          </w:rPr>
+          <w:t>Monetary Authority of Singapore. Past Monetary Policy Decisions.</w:t>
+        </w:r>
+      </w:hyperlink>
+    </w:p>
     <w:sectPr>
-      <w:footerReference w:type="default" r:id="rId7"/>
+      <w:footerReference w:type="default" r:id="rId12"/>
       <w:pgSz w:w="11906" w:h="16838"/>
       <w:pgMar w:top="1440" w:right="1440" w:bottom="1440" w:left="1440" w:header="708" w:footer="708" w:gutter="0"/>
       <w:cols w:space="708"/>
@@ -1710,6 +1784,46 @@
       <w:sz w:val="24"/>
     </w:rPr>
   </w:style>
+  <w:style w:type="paragraph" w:styleId="Caption">
+    <w:name w:val="caption"/>
+    <w:basedOn w:val="Normal"/>
+    <w:next w:val="Normal"/>
+    <w:qFormat/>
+    <w:pPr>
+      <w:keepLines/>
+      <w:spacing w:after="160"/>
+    </w:pPr>
+    <w:rPr>
+      <w:sz w:val="20"/>
+      <w:szCs w:val="20"/>
+    </w:rPr>
+  </w:style>
+  <w:style w:type="character" w:styleId="Hyperlink">
+    <w:name w:val="Hyperlink"/>
+    <w:basedOn w:val="DefaultParagraphFont"/>
+    <w:rPr>
+      <w:color w:val="0563C1"/>
+      <w:u w:val="single"/>
+    </w:rPr>
+  </w:style>
+  <w:style w:type="table" w:styleId="TableGrid">
+    <w:name w:val="Table Grid"/>
+    <w:basedOn w:val="TableNormal"/>
+    <w:uiPriority w:val="59"/>
+    <w:pPr>
+      <w:spacing w:after="0" w:line="240" w:lineRule="auto"/>
+    </w:pPr>
+    <w:tblPr/>
+  </w:style>
+  <w:style w:type="paragraph" w:customStyle="1" w:styleId="ArticleNote">
+    <w:name w:val="Article Note"/>
+    <w:basedOn w:val="Normal"/>
+    <w:next w:val="Normal"/>
+    <w:rPr>
+      <w:sz w:val="20"/>
+      <w:szCs w:val="20"/>
+    </w:rPr>
+  </w:style>
 </w:styles>
 </file>
 

</xml_diff>